<commit_message>
Finalize report with complete evidence
</commit_message>
<xml_diff>
--- a/docs/Heart_Disease_MLOps_Report.docx
+++ b/docs/Heart_Disease_MLOps_Report.docx
@@ -981,6 +981,106 @@
       </w:r>
     </w:p>
     <w:p>
+      <w:pPr>
+        <w:jc w:val="center"/>
+      </w:pPr>
+      <w:r>
+        <w:drawing>
+          <wp:inline xmlns:a="http://schemas.openxmlformats.org/drawingml/2006/main" xmlns:pic="http://schemas.openxmlformats.org/drawingml/2006/picture">
+            <wp:extent cx="5669280" cy="3254368"/>
+            <wp:docPr id="4" name="Picture 4"/>
+            <wp:cNvGraphicFramePr>
+              <a:graphicFrameLocks noChangeAspect="1"/>
+            </wp:cNvGraphicFramePr>
+            <a:graphic>
+              <a:graphicData uri="http://schemas.openxmlformats.org/drawingml/2006/picture">
+                <pic:pic>
+                  <pic:nvPicPr>
+                    <pic:cNvPr id="0" name="03_mlflow_runs.png"/>
+                    <pic:cNvPicPr/>
+                  </pic:nvPicPr>
+                  <pic:blipFill>
+                    <a:blip r:embed="rId13"/>
+                    <a:stretch>
+                      <a:fillRect/>
+                    </a:stretch>
+                  </pic:blipFill>
+                  <pic:spPr>
+                    <a:xfrm>
+                      <a:off x="0" y="0"/>
+                      <a:ext cx="5669280" cy="3254368"/>
+                    </a:xfrm>
+                    <a:prstGeom prst="rect"/>
+                  </pic:spPr>
+                </pic:pic>
+              </a:graphicData>
+            </a:graphic>
+          </wp:inline>
+        </w:drawing>
+      </w:r>
+    </w:p>
+    <w:p>
+      <w:pPr>
+        <w:jc w:val="center"/>
+      </w:pPr>
+      <w:r>
+        <w:rPr>
+          <w:i/>
+        </w:rPr>
+        <w:t>Figure 4. MLflow experiment comparison for both candidate models.</w:t>
+      </w:r>
+    </w:p>
+    <w:p>
+      <w:pPr>
+        <w:jc w:val="center"/>
+      </w:pPr>
+      <w:r>
+        <w:drawing>
+          <wp:inline xmlns:a="http://schemas.openxmlformats.org/drawingml/2006/main" xmlns:pic="http://schemas.openxmlformats.org/drawingml/2006/picture">
+            <wp:extent cx="5669280" cy="3377318"/>
+            <wp:docPr id="5" name="Picture 5"/>
+            <wp:cNvGraphicFramePr>
+              <a:graphicFrameLocks noChangeAspect="1"/>
+            </wp:cNvGraphicFramePr>
+            <a:graphic>
+              <a:graphicData uri="http://schemas.openxmlformats.org/drawingml/2006/picture">
+                <pic:pic>
+                  <pic:nvPicPr>
+                    <pic:cNvPr id="0" name="04_mlflow_best_run.png"/>
+                    <pic:cNvPicPr/>
+                  </pic:nvPicPr>
+                  <pic:blipFill>
+                    <a:blip r:embed="rId14"/>
+                    <a:stretch>
+                      <a:fillRect/>
+                    </a:stretch>
+                  </pic:blipFill>
+                  <pic:spPr>
+                    <a:xfrm>
+                      <a:off x="0" y="0"/>
+                      <a:ext cx="5669280" cy="3377318"/>
+                    </a:xfrm>
+                    <a:prstGeom prst="rect"/>
+                  </pic:spPr>
+                </pic:pic>
+              </a:graphicData>
+            </a:graphic>
+          </wp:inline>
+        </w:drawing>
+      </w:r>
+    </w:p>
+    <w:p>
+      <w:pPr>
+        <w:jc w:val="center"/>
+      </w:pPr>
+      <w:r>
+        <w:rPr>
+          <w:i/>
+        </w:rPr>
+        <w:t>Figure 5. Selected Logistic Regression run details in MLflow.</w:t>
+      </w:r>
+    </w:p>
+    <w:p>
       <w:r>
         <w:br w:type="page"/>
       </w:r>
@@ -995,7 +1095,7 @@
     </w:p>
     <w:p>
       <w:r>
-        <w:t>The winning preprocessing-classifier pipeline is stored with Joblib and accompanied by JSON metadata contains feature order, package version, candidate results, run identifier, and selection rationale. FastAPI validates all 13 fields and rejects missing, extra, or out-of-range values before invoking the model.</w:t>
+        <w:t>The winning preprocessing-classifier pipeline is stored with Joblib and accompanied by JSON metadata that contains feature order, package version, candidate results, run identifier, and selection rationale. FastAPI validates all 13 fields and rejects missing, extra, or out-of-range values before invoking the model.</w:t>
       </w:r>
     </w:p>
     <w:tbl>
@@ -1176,6 +1276,56 @@
       </w:r>
     </w:p>
     <w:p>
+      <w:pPr>
+        <w:jc w:val="center"/>
+      </w:pPr>
+      <w:r>
+        <w:drawing>
+          <wp:inline xmlns:a="http://schemas.openxmlformats.org/drawingml/2006/main" xmlns:pic="http://schemas.openxmlformats.org/drawingml/2006/picture">
+            <wp:extent cx="5669280" cy="3298705"/>
+            <wp:docPr id="6" name="Picture 6"/>
+            <wp:cNvGraphicFramePr>
+              <a:graphicFrameLocks noChangeAspect="1"/>
+            </wp:cNvGraphicFramePr>
+            <a:graphic>
+              <a:graphicData uri="http://schemas.openxmlformats.org/drawingml/2006/picture">
+                <pic:pic>
+                  <pic:nvPicPr>
+                    <pic:cNvPr id="0" name="07_docker_api.png"/>
+                    <pic:cNvPicPr/>
+                  </pic:nvPicPr>
+                  <pic:blipFill>
+                    <a:blip r:embed="rId15"/>
+                    <a:stretch>
+                      <a:fillRect/>
+                    </a:stretch>
+                  </pic:blipFill>
+                  <pic:spPr>
+                    <a:xfrm>
+                      <a:off x="0" y="0"/>
+                      <a:ext cx="5669280" cy="3298705"/>
+                    </a:xfrm>
+                    <a:prstGeom prst="rect"/>
+                  </pic:spPr>
+                </pic:pic>
+              </a:graphicData>
+            </a:graphic>
+          </wp:inline>
+        </w:drawing>
+      </w:r>
+    </w:p>
+    <w:p>
+      <w:pPr>
+        <w:jc w:val="center"/>
+      </w:pPr>
+      <w:r>
+        <w:rPr>
+          <w:i/>
+        </w:rPr>
+        <w:t>Figure 6. Healthy isolated Docker container and successful prediction response.</w:t>
+      </w:r>
+    </w:p>
+    <w:p>
       <w:r>
         <w:br w:type="page"/>
       </w:r>
@@ -1241,7 +1391,7 @@
         <w:drawing>
           <wp:inline xmlns:a="http://schemas.openxmlformats.org/drawingml/2006/main" xmlns:pic="http://schemas.openxmlformats.org/drawingml/2006/picture">
             <wp:extent cx="5669280" cy="2918718"/>
-            <wp:docPr id="4" name="Picture 4"/>
+            <wp:docPr id="7" name="Picture 7"/>
             <wp:cNvGraphicFramePr>
               <a:graphicFrameLocks noChangeAspect="1"/>
             </wp:cNvGraphicFramePr>
@@ -1253,7 +1403,7 @@
                     <pic:cNvPicPr/>
                   </pic:nvPicPr>
                   <pic:blipFill>
-                    <a:blip r:embed="rId13"/>
+                    <a:blip r:embed="rId16"/>
                     <a:stretch>
                       <a:fillRect/>
                     </a:stretch>
@@ -1280,7 +1430,7 @@
         <w:rPr>
           <w:i/>
         </w:rPr>
-        <w:t>Figure 4. Successful CI/CD pipeline (replace with genuine run evidence).</w:t>
+        <w:t>Figure 7. Successful CI/CD pipeline from lint through image packaging.</w:t>
       </w:r>
     </w:p>
     <w:p>
@@ -1484,7 +1634,7 @@
         <w:drawing>
           <wp:inline xmlns:a="http://schemas.openxmlformats.org/drawingml/2006/main" xmlns:pic="http://schemas.openxmlformats.org/drawingml/2006/picture">
             <wp:extent cx="5669280" cy="1883877"/>
-            <wp:docPr id="5" name="Picture 5"/>
+            <wp:docPr id="8" name="Picture 8"/>
             <wp:cNvGraphicFramePr>
               <a:graphicFrameLocks noChangeAspect="1"/>
             </wp:cNvGraphicFramePr>
@@ -1496,7 +1646,7 @@
                     <pic:cNvPicPr/>
                   </pic:nvPicPr>
                   <pic:blipFill>
-                    <a:blip r:embed="rId14"/>
+                    <a:blip r:embed="rId17"/>
                     <a:stretch>
                       <a:fillRect/>
                     </a:stretch>
@@ -1523,7 +1673,57 @@
         <w:rPr>
           <w:i/>
         </w:rPr>
-        <w:t>Figure 5. Healthy Kubernetes workloads (replace with genuine evidence).</w:t>
+        <w:t>Figure 8. Healthy Kubernetes deployments, pods, and exposed services.</w:t>
+      </w:r>
+    </w:p>
+    <w:p>
+      <w:pPr>
+        <w:jc w:val="center"/>
+      </w:pPr>
+      <w:r>
+        <w:drawing>
+          <wp:inline xmlns:a="http://schemas.openxmlformats.org/drawingml/2006/main" xmlns:pic="http://schemas.openxmlformats.org/drawingml/2006/picture">
+            <wp:extent cx="5669280" cy="1767793"/>
+            <wp:docPr id="9" name="Picture 9"/>
+            <wp:cNvGraphicFramePr>
+              <a:graphicFrameLocks noChangeAspect="1"/>
+            </wp:cNvGraphicFramePr>
+            <a:graphic>
+              <a:graphicData uri="http://schemas.openxmlformats.org/drawingml/2006/picture">
+                <pic:pic>
+                  <pic:nvPicPr>
+                    <pic:cNvPr id="0" name="10_kubernetes_predict.png"/>
+                    <pic:cNvPicPr/>
+                  </pic:nvPicPr>
+                  <pic:blipFill>
+                    <a:blip r:embed="rId18"/>
+                    <a:stretch>
+                      <a:fillRect/>
+                    </a:stretch>
+                  </pic:blipFill>
+                  <pic:spPr>
+                    <a:xfrm>
+                      <a:off x="0" y="0"/>
+                      <a:ext cx="5669280" cy="1767793"/>
+                    </a:xfrm>
+                    <a:prstGeom prst="rect"/>
+                  </pic:spPr>
+                </pic:pic>
+              </a:graphicData>
+            </a:graphic>
+          </wp:inline>
+        </w:drawing>
+      </w:r>
+    </w:p>
+    <w:p>
+      <w:pPr>
+        <w:jc w:val="center"/>
+      </w:pPr>
+      <w:r>
+        <w:rPr>
+          <w:i/>
+        </w:rPr>
+        <w:t>Figure 9. Prediction served through the Kubernetes LoadBalancer service.</w:t>
       </w:r>
     </w:p>
     <w:p>
@@ -1591,8 +1791,58 @@
       <w:r>
         <w:drawing>
           <wp:inline xmlns:a="http://schemas.openxmlformats.org/drawingml/2006/main" xmlns:pic="http://schemas.openxmlformats.org/drawingml/2006/picture">
+            <wp:extent cx="5669280" cy="3272103"/>
+            <wp:docPr id="10" name="Picture 10"/>
+            <wp:cNvGraphicFramePr>
+              <a:graphicFrameLocks noChangeAspect="1"/>
+            </wp:cNvGraphicFramePr>
+            <a:graphic>
+              <a:graphicData uri="http://schemas.openxmlformats.org/drawingml/2006/picture">
+                <pic:pic>
+                  <pic:nvPicPr>
+                    <pic:cNvPr id="0" name="05_prometheus_targets.png"/>
+                    <pic:cNvPicPr/>
+                  </pic:nvPicPr>
+                  <pic:blipFill>
+                    <a:blip r:embed="rId19"/>
+                    <a:stretch>
+                      <a:fillRect/>
+                    </a:stretch>
+                  </pic:blipFill>
+                  <pic:spPr>
+                    <a:xfrm>
+                      <a:off x="0" y="0"/>
+                      <a:ext cx="5669280" cy="3272103"/>
+                    </a:xfrm>
+                    <a:prstGeom prst="rect"/>
+                  </pic:spPr>
+                </pic:pic>
+              </a:graphicData>
+            </a:graphic>
+          </wp:inline>
+        </w:drawing>
+      </w:r>
+    </w:p>
+    <w:p>
+      <w:pPr>
+        <w:jc w:val="center"/>
+      </w:pPr>
+      <w:r>
+        <w:rPr>
+          <w:i/>
+        </w:rPr>
+        <w:t>Figure 10. Prometheus API target in the UP state.</w:t>
+      </w:r>
+    </w:p>
+    <w:p>
+      <w:pPr>
+        <w:jc w:val="center"/>
+      </w:pPr>
+      <w:r>
+        <w:drawing>
+          <wp:inline xmlns:a="http://schemas.openxmlformats.org/drawingml/2006/main" xmlns:pic="http://schemas.openxmlformats.org/drawingml/2006/picture">
             <wp:extent cx="5669280" cy="3375352"/>
-            <wp:docPr id="6" name="Picture 6"/>
+            <wp:docPr id="11" name="Picture 11"/>
             <wp:cNvGraphicFramePr>
               <a:graphicFrameLocks noChangeAspect="1"/>
             </wp:cNvGraphicFramePr>
@@ -1604,7 +1854,7 @@
                     <pic:cNvPicPr/>
                   </pic:nvPicPr>
                   <pic:blipFill>
-                    <a:blip r:embed="rId15"/>
+                    <a:blip r:embed="rId20"/>
                     <a:stretch>
                       <a:fillRect/>
                     </a:stretch>
@@ -1631,7 +1881,57 @@
         <w:rPr>
           <w:i/>
         </w:rPr>
-        <w:t>Figure 6. Provisioned operations dashboard (replace with genuine evidence).</w:t>
+        <w:t>Figure 11. Provisioned Grafana operations dashboard with live metrics.</w:t>
+      </w:r>
+    </w:p>
+    <w:p>
+      <w:pPr>
+        <w:jc w:val="center"/>
+      </w:pPr>
+      <w:r>
+        <w:drawing>
+          <wp:inline xmlns:a="http://schemas.openxmlformats.org/drawingml/2006/main" xmlns:pic="http://schemas.openxmlformats.org/drawingml/2006/picture">
+            <wp:extent cx="5669280" cy="3060791"/>
+            <wp:docPr id="12" name="Picture 12"/>
+            <wp:cNvGraphicFramePr>
+              <a:graphicFrameLocks noChangeAspect="1"/>
+            </wp:cNvGraphicFramePr>
+            <a:graphic>
+              <a:graphicData uri="http://schemas.openxmlformats.org/drawingml/2006/picture">
+                <pic:pic>
+                  <pic:nvPicPr>
+                    <pic:cNvPr id="0" name="12_api_logs.png"/>
+                    <pic:cNvPicPr/>
+                  </pic:nvPicPr>
+                  <pic:blipFill>
+                    <a:blip r:embed="rId21"/>
+                    <a:stretch>
+                      <a:fillRect/>
+                    </a:stretch>
+                  </pic:blipFill>
+                  <pic:spPr>
+                    <a:xfrm>
+                      <a:off x="0" y="0"/>
+                      <a:ext cx="5669280" cy="3060791"/>
+                    </a:xfrm>
+                    <a:prstGeom prst="rect"/>
+                  </pic:spPr>
+                </pic:pic>
+              </a:graphicData>
+            </a:graphic>
+          </wp:inline>
+        </w:drawing>
+      </w:r>
+    </w:p>
+    <w:p>
+      <w:pPr>
+        <w:jc w:val="center"/>
+      </w:pPr>
+      <w:r>
+        <w:rPr>
+          <w:i/>
+        </w:rPr>
+        <w:t>Figure 12. Structured request logs with status, latency, and request IDs.</w:t>
       </w:r>
     </w:p>
     <w:p>
@@ -1796,7 +2096,7 @@
     </w:p>
     <w:p>
       <w:r>
-        <w:t>Attach genuine execution screenshots under the screenshots directory. Do not submit placeholders. Record the repository URL, successful CI run URL, local or public API access instruction, and video link in the final submission form.</w:t>
+        <w:t>The repository screenshots directory contains execution evidence for MLflow, CI/CD, Docker, Kubernetes, Prometheus, Grafana, and structured API logs. The repository URL, local API access instructions, and demonstration video link complete the submission.</w:t>
       </w:r>
     </w:p>
     <w:sectPr>

</xml_diff>

<commit_message>
Regenerate final report with redacted evidence
</commit_message>
<xml_diff>
--- a/docs/Heart_Disease_MLOps_Report.docx
+++ b/docs/Heart_Disease_MLOps_Report.docx
@@ -987,7 +987,7 @@
       <w:r>
         <w:drawing>
           <wp:inline xmlns:a="http://schemas.openxmlformats.org/drawingml/2006/main" xmlns:pic="http://schemas.openxmlformats.org/drawingml/2006/picture">
-            <wp:extent cx="5669280" cy="3254368"/>
+            <wp:extent cx="5669280" cy="2282260"/>
             <wp:docPr id="4" name="Picture 4"/>
             <wp:cNvGraphicFramePr>
               <a:graphicFrameLocks noChangeAspect="1"/>
@@ -1008,7 +1008,7 @@
                   <pic:spPr>
                     <a:xfrm>
                       <a:off x="0" y="0"/>
-                      <a:ext cx="5669280" cy="3254368"/>
+                      <a:ext cx="5669280" cy="2282260"/>
                     </a:xfrm>
                     <a:prstGeom prst="rect"/>
                   </pic:spPr>
@@ -1037,7 +1037,7 @@
       <w:r>
         <w:drawing>
           <wp:inline xmlns:a="http://schemas.openxmlformats.org/drawingml/2006/main" xmlns:pic="http://schemas.openxmlformats.org/drawingml/2006/picture">
-            <wp:extent cx="5669280" cy="3377318"/>
+            <wp:extent cx="5669280" cy="3055582"/>
             <wp:docPr id="5" name="Picture 5"/>
             <wp:cNvGraphicFramePr>
               <a:graphicFrameLocks noChangeAspect="1"/>
@@ -1058,7 +1058,7 @@
                   <pic:spPr>
                     <a:xfrm>
                       <a:off x="0" y="0"/>
-                      <a:ext cx="5669280" cy="3377318"/>
+                      <a:ext cx="5669280" cy="3055582"/>
                     </a:xfrm>
                     <a:prstGeom prst="rect"/>
                   </pic:spPr>
@@ -1282,7 +1282,7 @@
       <w:r>
         <w:drawing>
           <wp:inline xmlns:a="http://schemas.openxmlformats.org/drawingml/2006/main" xmlns:pic="http://schemas.openxmlformats.org/drawingml/2006/picture">
-            <wp:extent cx="5669280" cy="3298705"/>
+            <wp:extent cx="5669280" cy="3422144"/>
             <wp:docPr id="6" name="Picture 6"/>
             <wp:cNvGraphicFramePr>
               <a:graphicFrameLocks noChangeAspect="1"/>
@@ -1303,7 +1303,7 @@
                   <pic:spPr>
                     <a:xfrm>
                       <a:off x="0" y="0"/>
-                      <a:ext cx="5669280" cy="3298705"/>
+                      <a:ext cx="5669280" cy="3422144"/>
                     </a:xfrm>
                     <a:prstGeom prst="rect"/>
                   </pic:spPr>
@@ -1791,7 +1791,7 @@
       <w:r>
         <w:drawing>
           <wp:inline xmlns:a="http://schemas.openxmlformats.org/drawingml/2006/main" xmlns:pic="http://schemas.openxmlformats.org/drawingml/2006/picture">
-            <wp:extent cx="5669280" cy="3272103"/>
+            <wp:extent cx="5669280" cy="2976710"/>
             <wp:docPr id="10" name="Picture 10"/>
             <wp:cNvGraphicFramePr>
               <a:graphicFrameLocks noChangeAspect="1"/>
@@ -1812,7 +1812,7 @@
                   <pic:spPr>
                     <a:xfrm>
                       <a:off x="0" y="0"/>
-                      <a:ext cx="5669280" cy="3272103"/>
+                      <a:ext cx="5669280" cy="2976710"/>
                     </a:xfrm>
                     <a:prstGeom prst="rect"/>
                   </pic:spPr>
@@ -1841,7 +1841,7 @@
       <w:r>
         <w:drawing>
           <wp:inline xmlns:a="http://schemas.openxmlformats.org/drawingml/2006/main" xmlns:pic="http://schemas.openxmlformats.org/drawingml/2006/picture">
-            <wp:extent cx="5669280" cy="3375352"/>
+            <wp:extent cx="5669280" cy="3114374"/>
             <wp:docPr id="11" name="Picture 11"/>
             <wp:cNvGraphicFramePr>
               <a:graphicFrameLocks noChangeAspect="1"/>
@@ -1862,7 +1862,7 @@
                   <pic:spPr>
                     <a:xfrm>
                       <a:off x="0" y="0"/>
-                      <a:ext cx="5669280" cy="3375352"/>
+                      <a:ext cx="5669280" cy="3114374"/>
                     </a:xfrm>
                     <a:prstGeom prst="rect"/>
                   </pic:spPr>

</xml_diff>

<commit_message>
Regenerate report with setup instructions
</commit_message>
<xml_diff>
--- a/docs/Heart_Disease_MLOps_Report.docx
+++ b/docs/Heart_Disease_MLOps_Report.docx
@@ -2018,6 +2018,73 @@
         <w:pStyle w:val="Heading2"/>
       </w:pPr>
       <w:r>
+        <w:t>Clean setup and installation</w:t>
+      </w:r>
+    </w:p>
+    <w:p>
+      <w:r>
+        <w:t>A clean Linux host requires Git, Docker Engine with Compose v2, kubectl, Minikube, and Python 3.10-3.12. The BITS VM run used an isolated Conda environment so project packages did not modify the base environment.</w:t>
+      </w:r>
+    </w:p>
+    <w:p>
+      <w:r>
+        <w:rPr>
+          <w:rFonts w:ascii="Consolas" w:hAnsi="Consolas"/>
+          <w:sz w:val="18"/>
+        </w:rPr>
+        <w:t>conda create -n heart-mlops python=3.12 -y</w:t>
+      </w:r>
+    </w:p>
+    <w:p>
+      <w:r>
+        <w:rPr>
+          <w:rFonts w:ascii="Consolas" w:hAnsi="Consolas"/>
+          <w:sz w:val="18"/>
+        </w:rPr>
+        <w:t>conda activate heart-mlops</w:t>
+      </w:r>
+    </w:p>
+    <w:p>
+      <w:r>
+        <w:rPr>
+          <w:rFonts w:ascii="Consolas" w:hAnsi="Consolas"/>
+          <w:sz w:val="18"/>
+        </w:rPr>
+        <w:t>python -m pip install --upgrade pip setuptools wheel</w:t>
+      </w:r>
+    </w:p>
+    <w:p>
+      <w:r>
+        <w:rPr>
+          <w:rFonts w:ascii="Consolas" w:hAnsi="Consolas"/>
+          <w:sz w:val="18"/>
+        </w:rPr>
+        <w:t>python -m pip install -r requirements-dev.txt</w:t>
+      </w:r>
+    </w:p>
+    <w:p>
+      <w:r>
+        <w:rPr>
+          <w:rFonts w:ascii="Consolas" w:hAnsi="Consolas"/>
+          <w:sz w:val="18"/>
+        </w:rPr>
+        <w:t>python -m pip install --no-deps -e .</w:t>
+      </w:r>
+    </w:p>
+    <w:p>
+      <w:r>
+        <w:rPr>
+          <w:rFonts w:ascii="Consolas" w:hAnsi="Consolas"/>
+          <w:sz w:val="18"/>
+        </w:rPr>
+        <w:t>python -m pip check</w:t>
+      </w:r>
+    </w:p>
+    <w:p>
+      <w:pPr>
+        <w:pStyle w:val="Heading2"/>
+      </w:pPr>
+      <w:r>
         <w:t>Reproduction commands</w:t>
       </w:r>
     </w:p>

</xml_diff>